<commit_message>
Atualiza documento oficial de regras: acesso sem login do Validador de Projetos
Reflete no docx a mudança do commit anterior (7c6fb78): o Validador de Projetos passa a ser acessível sem login, sem depender de ativação do Admin; login só é exigido para vincular a avaliação a um projeto.

Co-Authored-By: Claude Sonnet 5 <noreply@anthropic.com>
</commit_message>
<xml_diff>
--- a/Regras de Acesso e Permissoes - Sistema UNIALFA.docx
+++ b/Regras de Acesso e Permissoes - Sistema UNIALFA.docx
@@ -112,7 +112,7 @@
           <w:color w:val="1A1A1A"/>
           <w:sz w:val="22"/>
         </w:rPr>
-        <w:t>Todos os 14 formularios do sistema exigem login antes de carregar ou salvar qualquer dado. O login pode ser feito de duas formas:</w:t>
+        <w:t>A maioria dos 14 formularios do sistema exige login antes de carregar ou salvar qualquer dado. O login pode ser feito de duas formas:</w:t>
       </w:r>
     </w:p>
     <w:p>
@@ -172,7 +172,7 @@
           <w:color w:val="1A1A1A"/>
           <w:sz w:val="22"/>
         </w:rPr>
-        <w:t>A unica pagina aberta sem exigir login e a pagina inicial (index.html, mapa de diretrizes) - ela mostra o conteudo institucional livremente e so exibe a barra "Conectado como..." caso ja exista uma sessao ativa.</w:t>
+        <w:t>As paginas abertas sem exigir login sao a pagina inicial (index.html, mapa de diretrizes) e o Validador de Projetos (ferramenta de apoio a decisao) - ambas mostram o conteudo livremente e so exibem a barra "Conectado como..." caso ja exista uma sessao ativa. Diferente da Solicitacao de Demanda e da Ata de Reuniao (secao 2), o acesso sem login do Validador nao depende de nenhuma ativacao pelo Admin - e sempre aberto.</w:t>
       </w:r>
     </w:p>
     <w:p>
@@ -309,15 +309,8 @@
           <w:color w:val="1A1A1A"/>
           <w:sz w:val="22"/>
         </w:rPr>
-        <w:t xml:space="preserve">Cada um dos dois formularios tem um interruptor independente, controlado exclusivamente pelo Admin, na aba "Configuracoes" da pagina de Administracao. Ou seja, </w:t>
-      </w:r>
-      <w:r>
-        <w:rPr>
-          <w:color w:val="1A1A1A"/>
-          <w:sz w:val="22"/>
-        </w:rPr>
         <w:lastRenderedPageBreak/>
-        <w:t>e possivel ativar o "sem login" so na Solicitacao de Demanda, so na Ata, nas duas, ou em nenhuma - sao chaves separadas.</w:t>
+        <w:t>Cada um dos dois formularios tem um interruptor independente, controlado exclusivamente pelo Admin, na aba "Configuracoes" da pagina de Administracao. Ou seja, e possivel ativar o "sem login" so na Solicitacao de Demanda, so na Ata, nas duas, ou em nenhuma - sao chaves separadas.</w:t>
       </w:r>
     </w:p>
     <w:p>
@@ -528,45 +521,36 @@
     </w:p>
     <w:p>
       <w:pPr>
-        <w:spacing w:before="120" w:after="200" w:line="280" w:lineRule="auto"/>
-        <w:rPr>
-          <w:color w:val="1A1A1A"/>
-          <w:sz w:val="22"/>
-        </w:rPr>
-      </w:pPr>
-    </w:p>
-    <w:p>
-      <w:pPr>
-        <w:spacing w:before="360" w:line="280" w:lineRule="auto"/>
+        <w:spacing w:before="240" w:after="120" w:line="280" w:lineRule="auto"/>
         <w:rPr>
           <w:b/>
-          <w:color w:val="1A1A1A"/>
-          <w:sz w:val="32"/>
+          <w:color w:val="B91D2E"/>
+          <w:sz w:val="26"/>
         </w:rPr>
       </w:pPr>
       <w:r>
         <w:rPr>
           <w:b/>
-          <w:color w:val="1A1A1A"/>
-          <w:sz w:val="32"/>
-        </w:rPr>
-        <w:t>3. Papeis de usuario</w:t>
-      </w:r>
-    </w:p>
-    <w:p>
-      <w:pPr>
-        <w:spacing w:before="360" w:line="280" w:lineRule="auto"/>
-        <w:rPr>
-          <w:color w:val="1A1A1A"/>
-          <w:sz w:val="22"/>
-        </w:rPr>
-      </w:pPr>
-      <w:r>
-        <w:rPr>
-          <w:color w:val="1A1A1A"/>
-          <w:sz w:val="22"/>
-        </w:rPr>
-        <w:t>Cada pessoa que faz login recebe um papel, usado para liberar ou restringir acoes especificas no sistema:</w:t>
+          <w:color w:val="B91D2E"/>
+          <w:sz w:val="26"/>
+        </w:rPr>
+        <w:t>2.5 Caso particular: Validador de Projetos</w:t>
+      </w:r>
+    </w:p>
+    <w:p>
+      <w:pPr>
+        <w:spacing w:before="240" w:line="280" w:lineRule="auto"/>
+        <w:rPr>
+          <w:color w:val="1A1A1A"/>
+          <w:sz w:val="22"/>
+        </w:rPr>
+      </w:pPr>
+      <w:r>
+        <w:rPr>
+          <w:color w:val="1A1A1A"/>
+          <w:sz w:val="22"/>
+        </w:rPr>
+        <w:t>O Validador de Projetos e mais aberto que os dois formularios acima: o quadro de conexoes, o simulador "e se?" e o assistente de decisao (8 perguntas, com veredito) funcionam por inteiro sem nenhum login - nao ha selo, nao ha admin para ativar, e nao ha bloqueio de nenhuma acao dentro da propria ferramenta.</w:t>
       </w:r>
     </w:p>
     <w:p>
@@ -576,7 +560,7 @@
           <w:ilvl w:val="0"/>
           <w:numId w:val="4"/>
         </w:numPr>
-        <w:spacing w:before="360" w:after="80" w:line="260" w:lineRule="auto"/>
+        <w:spacing w:before="240" w:after="80" w:line="260" w:lineRule="auto"/>
         <w:ind w:left="700"/>
         <w:rPr>
           <w:color w:val="1A1A1A"/>
@@ -588,7 +572,7 @@
           <w:color w:val="1A1A1A"/>
           <w:sz w:val="22"/>
         </w:rPr>
-        <w:t>Solicitante - papel padrao, atribuido automaticamente a todo novo usuario no primeiro login.</w:t>
+        <w:t>Login so e pedido para uma funcionalidade especifica: vincular a avaliacao a um "Projeto vinculado" e salvar o veredito no historico daquele projeto.</w:t>
       </w:r>
     </w:p>
     <w:p>
@@ -598,7 +582,7 @@
           <w:ilvl w:val="0"/>
           <w:numId w:val="4"/>
         </w:numPr>
-        <w:spacing w:before="360" w:after="80" w:line="260" w:lineRule="auto"/>
+        <w:spacing w:before="240" w:after="80" w:line="260" w:lineRule="auto"/>
         <w:ind w:left="700"/>
         <w:rPr>
           <w:color w:val="1A1A1A"/>
@@ -610,7 +594,7 @@
           <w:color w:val="1A1A1A"/>
           <w:sz w:val="22"/>
         </w:rPr>
-        <w:t>Gerente de Projetos</w:t>
+        <w:t>Sem login, essa area do painel mostra um aviso com um botao "Entrar" - a pessoa pode logar a qualquer momento sem perder as respostas ja dadas no assistente.</w:t>
       </w:r>
     </w:p>
     <w:p>
@@ -620,7 +604,7 @@
           <w:ilvl w:val="0"/>
           <w:numId w:val="4"/>
         </w:numPr>
-        <w:spacing w:before="360" w:after="80" w:line="260" w:lineRule="auto"/>
+        <w:spacing w:before="240" w:after="80" w:line="260" w:lineRule="auto"/>
         <w:ind w:left="700"/>
         <w:rPr>
           <w:color w:val="1A1A1A"/>
@@ -632,108 +616,50 @@
           <w:color w:val="1A1A1A"/>
           <w:sz w:val="22"/>
         </w:rPr>
-        <w:t>Gestor Responsavel</w:t>
-      </w:r>
-    </w:p>
-    <w:p>
-      <w:pPr>
-        <w:pStyle w:val="PargrafodaLista"/>
-        <w:numPr>
-          <w:ilvl w:val="0"/>
-          <w:numId w:val="4"/>
-        </w:numPr>
-        <w:spacing w:before="360" w:after="80" w:line="260" w:lineRule="auto"/>
-        <w:ind w:left="700"/>
-        <w:rPr>
-          <w:color w:val="1A1A1A"/>
-          <w:sz w:val="22"/>
-        </w:rPr>
-      </w:pPr>
-      <w:r>
-        <w:rPr>
-          <w:color w:val="1A1A1A"/>
-          <w:sz w:val="22"/>
-        </w:rPr>
-        <w:t>Dono do Negocio</w:t>
-      </w:r>
-    </w:p>
-    <w:p>
-      <w:pPr>
-        <w:pStyle w:val="PargrafodaLista"/>
-        <w:numPr>
-          <w:ilvl w:val="0"/>
-          <w:numId w:val="4"/>
-        </w:numPr>
-        <w:spacing w:before="360" w:after="80" w:line="260" w:lineRule="auto"/>
-        <w:ind w:left="700"/>
-        <w:rPr>
-          <w:color w:val="1A1A1A"/>
-          <w:sz w:val="22"/>
-        </w:rPr>
-      </w:pPr>
-      <w:r>
-        <w:rPr>
-          <w:color w:val="1A1A1A"/>
-          <w:sz w:val="22"/>
-        </w:rPr>
-        <w:t>Alta Gestao</w:t>
-      </w:r>
-    </w:p>
-    <w:p>
-      <w:pPr>
-        <w:pStyle w:val="PargrafodaLista"/>
-        <w:numPr>
-          <w:ilvl w:val="0"/>
-          <w:numId w:val="4"/>
-        </w:numPr>
-        <w:spacing w:before="360" w:after="80" w:line="260" w:lineRule="auto"/>
-        <w:ind w:left="700"/>
-        <w:rPr>
-          <w:color w:val="1A1A1A"/>
-          <w:sz w:val="22"/>
-        </w:rPr>
-      </w:pPr>
-      <w:r>
-        <w:rPr>
-          <w:color w:val="1A1A1A"/>
-          <w:sz w:val="22"/>
-        </w:rPr>
-        <w:lastRenderedPageBreak/>
-        <w:t>Admin - papel de administracao do sistema, atribuido manualmente por quem ja e Admin.</w:t>
-      </w:r>
-    </w:p>
-    <w:p>
-      <w:pPr>
-        <w:spacing w:before="240" w:after="120" w:line="260" w:lineRule="auto"/>
+        <w:t>Depois de logada, a pessoa ve o campo de projeto normalmente, como qualquer outro usuario autenticado.</w:t>
+      </w:r>
+    </w:p>
+    <w:p>
+      <w:pPr>
+        <w:spacing w:before="120" w:after="200" w:line="260" w:lineRule="auto"/>
+        <w:rPr>
+          <w:color w:val="1A1A1A"/>
+          <w:sz w:val="22"/>
+        </w:rPr>
+      </w:pPr>
+    </w:p>
+    <w:p>
+      <w:pPr>
+        <w:spacing w:before="360" w:line="260" w:lineRule="auto"/>
         <w:rPr>
           <w:b/>
-          <w:color w:val="B91D2E"/>
-          <w:sz w:val="26"/>
+          <w:color w:val="1A1A1A"/>
+          <w:sz w:val="32"/>
         </w:rPr>
       </w:pPr>
       <w:r>
         <w:rPr>
           <w:b/>
-          <w:color w:val="B91D2E"/>
-          <w:sz w:val="26"/>
-        </w:rPr>
-        <w:t>3.1 Acoes exclusivas de Admin</w:t>
-      </w:r>
-    </w:p>
-    <w:p>
-      <w:pPr>
-        <w:spacing w:before="240" w:line="280" w:lineRule="auto"/>
-        <w:rPr>
-          <w:color w:val="1A1A1A"/>
-          <w:sz w:val="22"/>
-        </w:rPr>
-      </w:pPr>
-      <w:r>
-        <w:rPr>
-          <w:color w:val="1A1A1A"/>
-          <w:sz w:val="22"/>
-        </w:rPr>
-        <w:t>Somente usuarios com papel Admin podem:</w:t>
+          <w:color w:val="1A1A1A"/>
+          <w:sz w:val="32"/>
+        </w:rPr>
+        <w:t>3. Papeis de usuario</w:t>
+      </w:r>
+    </w:p>
+    <w:p>
+      <w:pPr>
+        <w:spacing w:before="360" w:line="280" w:lineRule="auto"/>
+        <w:rPr>
+          <w:color w:val="1A1A1A"/>
+          <w:sz w:val="22"/>
+        </w:rPr>
+      </w:pPr>
+      <w:r>
+        <w:rPr>
+          <w:color w:val="1A1A1A"/>
+          <w:sz w:val="22"/>
+        </w:rPr>
+        <w:t>Cada pessoa que faz login recebe um papel, usado para liberar ou restringir acoes especificas no sistema:</w:t>
       </w:r>
     </w:p>
     <w:p>
@@ -743,7 +669,7 @@
           <w:ilvl w:val="0"/>
           <w:numId w:val="5"/>
         </w:numPr>
-        <w:spacing w:before="240" w:after="80" w:line="260" w:lineRule="auto"/>
+        <w:spacing w:before="360" w:after="80" w:line="260" w:lineRule="auto"/>
         <w:ind w:left="700"/>
         <w:rPr>
           <w:color w:val="1A1A1A"/>
@@ -755,7 +681,7 @@
           <w:color w:val="1A1A1A"/>
           <w:sz w:val="22"/>
         </w:rPr>
-        <w:t>Acessar a pagina de Administracao (qualquer outro papel ve a mensagem "Acesso restrito").</w:t>
+        <w:t>Solicitante - papel padrao, atribuido automaticamente a todo novo usuario no primeiro login.</w:t>
       </w:r>
     </w:p>
     <w:p>
@@ -765,7 +691,7 @@
           <w:ilvl w:val="0"/>
           <w:numId w:val="5"/>
         </w:numPr>
-        <w:spacing w:before="240" w:after="80" w:line="260" w:lineRule="auto"/>
+        <w:spacing w:before="360" w:after="80" w:line="260" w:lineRule="auto"/>
         <w:ind w:left="700"/>
         <w:rPr>
           <w:color w:val="1A1A1A"/>
@@ -777,7 +703,7 @@
           <w:color w:val="1A1A1A"/>
           <w:sz w:val="22"/>
         </w:rPr>
-        <w:t>Alterar o papel de outros usuarios.</w:t>
+        <w:t>Gerente de Projetos</w:t>
       </w:r>
     </w:p>
     <w:p>
@@ -787,7 +713,7 @@
           <w:ilvl w:val="0"/>
           <w:numId w:val="5"/>
         </w:numPr>
-        <w:spacing w:before="240" w:after="80" w:line="260" w:lineRule="auto"/>
+        <w:spacing w:before="360" w:after="80" w:line="260" w:lineRule="auto"/>
         <w:ind w:left="700"/>
         <w:rPr>
           <w:color w:val="1A1A1A"/>
@@ -799,7 +725,7 @@
           <w:color w:val="1A1A1A"/>
           <w:sz w:val="22"/>
         </w:rPr>
-        <w:t>Adicionar ou remover membros da equipe de um projeto.</w:t>
+        <w:t>Gestor Responsavel</w:t>
       </w:r>
     </w:p>
     <w:p>
@@ -809,7 +735,7 @@
           <w:ilvl w:val="0"/>
           <w:numId w:val="5"/>
         </w:numPr>
-        <w:spacing w:before="240" w:after="80" w:line="260" w:lineRule="auto"/>
+        <w:spacing w:before="360" w:after="80" w:line="260" w:lineRule="auto"/>
         <w:ind w:left="700"/>
         <w:rPr>
           <w:color w:val="1A1A1A"/>
@@ -821,7 +747,7 @@
           <w:color w:val="1A1A1A"/>
           <w:sz w:val="22"/>
         </w:rPr>
-        <w:t>Ativar/desativar as opcoes de "sem login" (Solicitacao de Demanda e Ata de Reuniao).</w:t>
+        <w:t>Dono do Negocio</w:t>
       </w:r>
     </w:p>
     <w:p>
@@ -831,7 +757,7 @@
           <w:ilvl w:val="0"/>
           <w:numId w:val="5"/>
         </w:numPr>
-        <w:spacing w:before="240" w:after="80" w:line="260" w:lineRule="auto"/>
+        <w:spacing w:before="360" w:after="80" w:line="260" w:lineRule="auto"/>
         <w:ind w:left="700"/>
         <w:rPr>
           <w:color w:val="1A1A1A"/>
@@ -843,71 +769,34 @@
           <w:color w:val="1A1A1A"/>
           <w:sz w:val="22"/>
         </w:rPr>
-        <w:t>Aprovar ou reprovar o Gate 1 na Solicitacao de Demanda (ver secao 4).</w:t>
-      </w:r>
-    </w:p>
-    <w:p>
-      <w:pPr>
-        <w:spacing w:before="240" w:line="280" w:lineRule="auto"/>
-        <w:rPr>
-          <w:color w:val="1A1A1A"/>
-          <w:sz w:val="22"/>
-        </w:rPr>
-      </w:pPr>
-      <w:r>
-        <w:rPr>
-          <w:color w:val="1A1A1A"/>
-          <w:sz w:val="22"/>
-        </w:rPr>
-        <w:t>Importante: um Admin sempre e considerado "membro" de qualquer equipe de projeto automaticamente - nao precisa ser adicionado manualmente para poder editar registros vinculados a um projeto (ver secao 5).</w:t>
-      </w:r>
-    </w:p>
-    <w:p>
-      <w:pPr>
-        <w:spacing w:before="120" w:after="200" w:line="280" w:lineRule="auto"/>
-        <w:rPr>
-          <w:color w:val="1A1A1A"/>
-          <w:sz w:val="22"/>
-        </w:rPr>
-      </w:pPr>
-    </w:p>
-    <w:p>
-      <w:pPr>
-        <w:spacing w:before="360" w:line="280" w:lineRule="auto"/>
-        <w:rPr>
-          <w:b/>
-          <w:color w:val="1A1A1A"/>
-          <w:sz w:val="32"/>
-        </w:rPr>
-      </w:pPr>
-      <w:r>
-        <w:rPr>
-          <w:b/>
-          <w:color w:val="1A1A1A"/>
-          <w:sz w:val="32"/>
-        </w:rPr>
-        <w:t>4. Gates de aprovacao</w:t>
-      </w:r>
-    </w:p>
-    <w:p>
-      <w:pPr>
-        <w:spacing w:before="360" w:line="280" w:lineRule="auto"/>
-        <w:rPr>
-          <w:color w:val="1A1A1A"/>
-          <w:sz w:val="22"/>
-        </w:rPr>
-      </w:pPr>
-      <w:r>
-        <w:rPr>
-          <w:color w:val="1A1A1A"/>
-          <w:sz w:val="22"/>
-        </w:rPr>
-        <w:t>O sistema tem dois pontos de decisao formal (gates) no ciclo de vida de um projeto, ambos aparecendo no fluxo de diretrizes da pagina inicial:</w:t>
-      </w:r>
-    </w:p>
-    <w:p>
-      <w:pPr>
-        <w:spacing w:before="240" w:after="120" w:line="280" w:lineRule="auto"/>
+        <w:t>Alta Gestao</w:t>
+      </w:r>
+    </w:p>
+    <w:p>
+      <w:pPr>
+        <w:pStyle w:val="PargrafodaLista"/>
+        <w:numPr>
+          <w:ilvl w:val="0"/>
+          <w:numId w:val="5"/>
+        </w:numPr>
+        <w:spacing w:before="360" w:after="80" w:line="260" w:lineRule="auto"/>
+        <w:ind w:left="700"/>
+        <w:rPr>
+          <w:color w:val="1A1A1A"/>
+          <w:sz w:val="22"/>
+        </w:rPr>
+      </w:pPr>
+      <w:r>
+        <w:rPr>
+          <w:color w:val="1A1A1A"/>
+          <w:sz w:val="22"/>
+        </w:rPr>
+        <w:t>Admin - papel de administracao do sistema, atribuido manualmente por quem ja e Admin.</w:t>
+      </w:r>
+    </w:p>
+    <w:p>
+      <w:pPr>
+        <w:spacing w:before="240" w:after="120" w:line="260" w:lineRule="auto"/>
         <w:rPr>
           <w:b/>
           <w:color w:val="B91D2E"/>
@@ -920,7 +809,7 @@
           <w:color w:val="B91D2E"/>
           <w:sz w:val="26"/>
         </w:rPr>
-        <w:t>4.1 Gate 1 - Triagem</w:t>
+        <w:t>3.1 Acoes exclusivas de Admin</w:t>
       </w:r>
     </w:p>
     <w:p>
@@ -936,7 +825,7 @@
           <w:color w:val="1A1A1A"/>
           <w:sz w:val="22"/>
         </w:rPr>
-        <w:t>Ocorre logo apos o registro da demanda (D01.4/D01.5). Decide se a demanda entra ou nao no portfolio de projetos.</w:t>
+        <w:t>Somente usuarios com papel Admin podem:</w:t>
       </w:r>
     </w:p>
     <w:p>
@@ -958,7 +847,7 @@
           <w:color w:val="1A1A1A"/>
           <w:sz w:val="22"/>
         </w:rPr>
-        <w:t>Quem decide: Admin (atuando como Gestor Responsavel no sistema).</w:t>
+        <w:t>Acessar a pagina de Administracao (qualquer outro papel ve a mensagem "Acesso restrito").</w:t>
       </w:r>
     </w:p>
     <w:p>
@@ -980,12 +869,137 @@
           <w:color w:val="1A1A1A"/>
           <w:sz w:val="22"/>
         </w:rPr>
-        <w:t>Onde: no status da Solicitacao de Demanda - so o Admin consegue alterar o campo de status; qualquer outro papel ve o campo travado, com um aviso explicando que so o PMO/Admin pode aprovar ou reprovar.</w:t>
-      </w:r>
-    </w:p>
-    <w:p>
-      <w:pPr>
-        <w:spacing w:before="240" w:after="120" w:line="260" w:lineRule="auto"/>
+        <w:t>Alterar o papel de outros usuarios.</w:t>
+      </w:r>
+    </w:p>
+    <w:p>
+      <w:pPr>
+        <w:pStyle w:val="PargrafodaLista"/>
+        <w:numPr>
+          <w:ilvl w:val="0"/>
+          <w:numId w:val="6"/>
+        </w:numPr>
+        <w:spacing w:before="240" w:after="80" w:line="260" w:lineRule="auto"/>
+        <w:ind w:left="700"/>
+        <w:rPr>
+          <w:color w:val="1A1A1A"/>
+          <w:sz w:val="22"/>
+        </w:rPr>
+      </w:pPr>
+      <w:r>
+        <w:rPr>
+          <w:color w:val="1A1A1A"/>
+          <w:sz w:val="22"/>
+        </w:rPr>
+        <w:t>Adicionar ou remover membros da equipe de um projeto.</w:t>
+      </w:r>
+    </w:p>
+    <w:p>
+      <w:pPr>
+        <w:pStyle w:val="PargrafodaLista"/>
+        <w:numPr>
+          <w:ilvl w:val="0"/>
+          <w:numId w:val="6"/>
+        </w:numPr>
+        <w:spacing w:before="240" w:after="80" w:line="260" w:lineRule="auto"/>
+        <w:ind w:left="700"/>
+        <w:rPr>
+          <w:color w:val="1A1A1A"/>
+          <w:sz w:val="22"/>
+        </w:rPr>
+      </w:pPr>
+      <w:r>
+        <w:rPr>
+          <w:color w:val="1A1A1A"/>
+          <w:sz w:val="22"/>
+        </w:rPr>
+        <w:t>Ativar/desativar as opcoes de "sem login" (Solicitacao de Demanda e Ata de Reuniao).</w:t>
+      </w:r>
+    </w:p>
+    <w:p>
+      <w:pPr>
+        <w:pStyle w:val="PargrafodaLista"/>
+        <w:numPr>
+          <w:ilvl w:val="0"/>
+          <w:numId w:val="6"/>
+        </w:numPr>
+        <w:spacing w:before="240" w:after="80" w:line="260" w:lineRule="auto"/>
+        <w:ind w:left="700"/>
+        <w:rPr>
+          <w:color w:val="1A1A1A"/>
+          <w:sz w:val="22"/>
+        </w:rPr>
+      </w:pPr>
+      <w:r>
+        <w:rPr>
+          <w:color w:val="1A1A1A"/>
+          <w:sz w:val="22"/>
+        </w:rPr>
+        <w:t>Aprovar ou reprovar o Gate 1 na Solicitacao de Demanda (ver secao 4).</w:t>
+      </w:r>
+    </w:p>
+    <w:p>
+      <w:pPr>
+        <w:spacing w:before="240" w:line="280" w:lineRule="auto"/>
+        <w:rPr>
+          <w:color w:val="1A1A1A"/>
+          <w:sz w:val="22"/>
+        </w:rPr>
+      </w:pPr>
+      <w:r>
+        <w:rPr>
+          <w:color w:val="1A1A1A"/>
+          <w:sz w:val="22"/>
+        </w:rPr>
+        <w:t>Importante: um Admin sempre e considerado "membro" de qualquer equipe de projeto automaticamente - nao precisa ser adicionado manualmente para poder editar registros vinculados a um projeto (ver secao 5).</w:t>
+      </w:r>
+    </w:p>
+    <w:p>
+      <w:pPr>
+        <w:spacing w:before="120" w:after="200" w:line="280" w:lineRule="auto"/>
+        <w:rPr>
+          <w:color w:val="1A1A1A"/>
+          <w:sz w:val="22"/>
+        </w:rPr>
+      </w:pPr>
+    </w:p>
+    <w:p>
+      <w:pPr>
+        <w:spacing w:before="360" w:line="280" w:lineRule="auto"/>
+        <w:rPr>
+          <w:b/>
+          <w:color w:val="1A1A1A"/>
+          <w:sz w:val="32"/>
+        </w:rPr>
+      </w:pPr>
+      <w:r>
+        <w:rPr>
+          <w:b/>
+          <w:color w:val="1A1A1A"/>
+          <w:sz w:val="32"/>
+        </w:rPr>
+        <w:t>4. Gates de aprovacao</w:t>
+      </w:r>
+    </w:p>
+    <w:p>
+      <w:pPr>
+        <w:spacing w:before="360" w:line="280" w:lineRule="auto"/>
+        <w:rPr>
+          <w:color w:val="1A1A1A"/>
+          <w:sz w:val="22"/>
+        </w:rPr>
+      </w:pPr>
+      <w:r>
+        <w:rPr>
+          <w:color w:val="1A1A1A"/>
+          <w:sz w:val="22"/>
+        </w:rPr>
+        <w:t>O sistema tem dois pontos de decisao formal (gates) no ciclo de vida de um projeto, ambos aparecendo no fluxo de diretrizes da pagina inicial:</w:t>
+      </w:r>
+    </w:p>
+    <w:p>
+      <w:pPr>
+        <w:spacing w:before="240" w:after="120" w:line="280" w:lineRule="auto"/>
         <w:rPr>
           <w:b/>
           <w:color w:val="B91D2E"/>
@@ -998,7 +1012,7 @@
           <w:color w:val="B91D2E"/>
           <w:sz w:val="26"/>
         </w:rPr>
-        <w:t>4.2 Gate 2 - Pactuacao</w:t>
+        <w:t>4.1 Gate 1 - Triagem</w:t>
       </w:r>
     </w:p>
     <w:p>
@@ -1014,7 +1028,7 @@
           <w:color w:val="1A1A1A"/>
           <w:sz w:val="22"/>
         </w:rPr>
-        <w:t>Ocorre ao final do Planejamento (D02), antes do inicio da Execucao (D03). E o gate mais critico: autoriza formalmente o inicio da execucao do projeto.</w:t>
+        <w:t>Ocorre logo apos o registro da demanda (D01.4/D01.5). Decide se a demanda entra ou nao no portfolio de projetos.</w:t>
       </w:r>
     </w:p>
     <w:p>
@@ -1036,85 +1050,7 @@
           <w:color w:val="1A1A1A"/>
           <w:sz w:val="22"/>
         </w:rPr>
-        <w:t>Quem decide: Dono do Negocio, perante a Alta Gestao (registrado institucionalmente; o sistema hoje nao implementa uma trava tecnica separada para este gate especificamente, alem do controle de papeis ja descrito).</w:t>
-      </w:r>
-    </w:p>
-    <w:p>
-      <w:pPr>
-        <w:spacing w:before="120" w:after="200" w:line="260" w:lineRule="auto"/>
-        <w:rPr>
-          <w:color w:val="1A1A1A"/>
-          <w:sz w:val="22"/>
-        </w:rPr>
-      </w:pPr>
-    </w:p>
-    <w:p>
-      <w:pPr>
-        <w:spacing w:before="360" w:line="260" w:lineRule="auto"/>
-        <w:rPr>
-          <w:b/>
-          <w:color w:val="1A1A1A"/>
-          <w:sz w:val="32"/>
-        </w:rPr>
-      </w:pPr>
-      <w:r>
-        <w:rPr>
-          <w:b/>
-          <w:color w:val="1A1A1A"/>
-          <w:sz w:val="32"/>
-        </w:rPr>
-        <w:lastRenderedPageBreak/>
-        <w:t>5. Restricao por equipe do projeto</w:t>
-      </w:r>
-    </w:p>
-    <w:p>
-      <w:pPr>
-        <w:spacing w:before="360" w:line="280" w:lineRule="auto"/>
-        <w:rPr>
-          <w:color w:val="1A1A1A"/>
-          <w:sz w:val="22"/>
-        </w:rPr>
-      </w:pPr>
-      <w:r>
-        <w:rPr>
-          <w:color w:val="1A1A1A"/>
-          <w:sz w:val="22"/>
-        </w:rPr>
-        <w:t>Varios formularios exigem vincular o registro a um "Projeto vinculado" (um projeto ja Aprovado no Gate 1). Nesses formularios, apenas quem faz parte da equipe daquele projeto especifico - ou um Admin - pode criar ou editar um registro vinculado a ele.</w:t>
-      </w:r>
-    </w:p>
-    <w:p>
-      <w:pPr>
-        <w:spacing w:before="240" w:after="120" w:line="280" w:lineRule="auto"/>
-        <w:rPr>
-          <w:b/>
-          <w:color w:val="B91D2E"/>
-          <w:sz w:val="26"/>
-        </w:rPr>
-      </w:pPr>
-      <w:r>
-        <w:rPr>
-          <w:b/>
-          <w:color w:val="B91D2E"/>
-          <w:sz w:val="26"/>
-        </w:rPr>
-        <w:t>5.1 Formularios com essa restricao</w:t>
-      </w:r>
-    </w:p>
-    <w:p>
-      <w:pPr>
-        <w:spacing w:before="240" w:line="280" w:lineRule="auto"/>
-        <w:rPr>
-          <w:color w:val="1A1A1A"/>
-          <w:sz w:val="22"/>
-        </w:rPr>
-      </w:pPr>
-      <w:r>
-        <w:rPr>
-          <w:color w:val="1A1A1A"/>
-          <w:sz w:val="22"/>
-        </w:rPr>
-        <w:t>Aplicada nos 7 formularios que usam o conceito de "equipe por projeto":</w:t>
+        <w:t>Quem decide: Admin (atuando como Gestor Responsavel no sistema).</w:t>
       </w:r>
     </w:p>
     <w:p>
@@ -1136,139 +1072,8 @@
           <w:color w:val="1A1A1A"/>
           <w:sz w:val="22"/>
         </w:rPr>
-        <w:t>Canvas de Projeto</w:t>
-      </w:r>
-    </w:p>
-    <w:p>
-      <w:pPr>
-        <w:pStyle w:val="PargrafodaLista"/>
-        <w:numPr>
-          <w:ilvl w:val="0"/>
-          <w:numId w:val="7"/>
-        </w:numPr>
-        <w:spacing w:before="240" w:after="80" w:line="260" w:lineRule="auto"/>
-        <w:ind w:left="700"/>
-        <w:rPr>
-          <w:color w:val="1A1A1A"/>
-          <w:sz w:val="22"/>
-        </w:rPr>
-      </w:pPr>
-      <w:r>
-        <w:rPr>
-          <w:color w:val="1A1A1A"/>
-          <w:sz w:val="22"/>
-        </w:rPr>
-        <w:t>TAP - Termo de Abertura de Projeto</w:t>
-      </w:r>
-    </w:p>
-    <w:p>
-      <w:pPr>
-        <w:pStyle w:val="PargrafodaLista"/>
-        <w:numPr>
-          <w:ilvl w:val="0"/>
-          <w:numId w:val="7"/>
-        </w:numPr>
-        <w:spacing w:before="240" w:after="80" w:line="260" w:lineRule="auto"/>
-        <w:ind w:left="700"/>
-        <w:rPr>
-          <w:color w:val="1A1A1A"/>
-          <w:sz w:val="22"/>
-        </w:rPr>
-      </w:pPr>
-      <w:r>
-        <w:rPr>
-          <w:color w:val="1A1A1A"/>
-          <w:sz w:val="22"/>
-        </w:rPr>
-        <w:t>Planejamento e Desenvolvimento de Projeto</w:t>
-      </w:r>
-    </w:p>
-    <w:p>
-      <w:pPr>
-        <w:pStyle w:val="PargrafodaLista"/>
-        <w:numPr>
-          <w:ilvl w:val="0"/>
-          <w:numId w:val="7"/>
-        </w:numPr>
-        <w:spacing w:before="240" w:after="80" w:line="260" w:lineRule="auto"/>
-        <w:ind w:left="700"/>
-        <w:rPr>
-          <w:color w:val="1A1A1A"/>
-          <w:sz w:val="22"/>
-        </w:rPr>
-      </w:pPr>
-      <w:r>
-        <w:rPr>
-          <w:color w:val="1A1A1A"/>
-          <w:sz w:val="22"/>
-        </w:rPr>
-        <w:t>EAP - Estrutura Analitica de Projeto</w:t>
-      </w:r>
-    </w:p>
-    <w:p>
-      <w:pPr>
-        <w:pStyle w:val="PargrafodaLista"/>
-        <w:numPr>
-          <w:ilvl w:val="0"/>
-          <w:numId w:val="7"/>
-        </w:numPr>
-        <w:spacing w:before="240" w:after="80" w:line="260" w:lineRule="auto"/>
-        <w:ind w:left="700"/>
-        <w:rPr>
-          <w:color w:val="1A1A1A"/>
-          <w:sz w:val="22"/>
-        </w:rPr>
-      </w:pPr>
-      <w:r>
-        <w:rPr>
-          <w:color w:val="1A1A1A"/>
-          <w:sz w:val="22"/>
-        </w:rPr>
-        <w:t>SMP - Solicitacao de Mudanca de Projeto</w:t>
-      </w:r>
-    </w:p>
-    <w:p>
-      <w:pPr>
-        <w:pStyle w:val="PargrafodaLista"/>
-        <w:numPr>
-          <w:ilvl w:val="0"/>
-          <w:numId w:val="7"/>
-        </w:numPr>
-        <w:spacing w:before="240" w:after="80" w:line="260" w:lineRule="auto"/>
-        <w:ind w:left="700"/>
-        <w:rPr>
-          <w:color w:val="1A1A1A"/>
-          <w:sz w:val="22"/>
-        </w:rPr>
-      </w:pPr>
-      <w:r>
-        <w:rPr>
-          <w:color w:val="1A1A1A"/>
-          <w:sz w:val="22"/>
-        </w:rPr>
-        <w:t>TEP - Termo de Encerramento de Projeto</w:t>
-      </w:r>
-    </w:p>
-    <w:p>
-      <w:pPr>
-        <w:pStyle w:val="PargrafodaLista"/>
-        <w:numPr>
-          <w:ilvl w:val="0"/>
-          <w:numId w:val="7"/>
-        </w:numPr>
-        <w:spacing w:before="240" w:after="80" w:line="260" w:lineRule="auto"/>
-        <w:ind w:left="700"/>
-        <w:rPr>
-          <w:color w:val="1A1A1A"/>
-          <w:sz w:val="22"/>
-        </w:rPr>
-      </w:pPr>
-      <w:r>
-        <w:rPr>
-          <w:color w:val="1A1A1A"/>
-          <w:sz w:val="22"/>
-        </w:rPr>
-        <w:t>RLA - Registro de Licoes Aprendidas</w:t>
+        <w:lastRenderedPageBreak/>
+        <w:t>Onde: no status da Solicitacao de Demanda - so o Admin consegue alterar o campo de status; qualquer outro papel ve o campo travado, com um aviso explicando que so o PMO/Admin pode aprovar ou reprovar.</w:t>
       </w:r>
     </w:p>
     <w:p>
@@ -1286,7 +1091,7 @@
           <w:color w:val="B91D2E"/>
           <w:sz w:val="26"/>
         </w:rPr>
-        <w:t>5.2 Como funciona</w:t>
+        <w:t>4.2 Gate 2 - Pactuacao</w:t>
       </w:r>
     </w:p>
     <w:p>
@@ -1302,7 +1107,7 @@
           <w:color w:val="1A1A1A"/>
           <w:sz w:val="22"/>
         </w:rPr>
-        <w:t>Ao selecionar um projeto no campo "Projeto vinculado":</w:t>
+        <w:t>Ocorre ao final do Planejamento (D02), antes do inicio da Execucao (D03). E o gate mais critico: autoriza formalmente o inicio da execucao do projeto.</w:t>
       </w:r>
     </w:p>
     <w:p>
@@ -1324,7 +1129,84 @@
           <w:color w:val="1A1A1A"/>
           <w:sz w:val="22"/>
         </w:rPr>
-        <w:t>Se a pessoa nao for da equipe daquele projeto (e nao for Admin), aparece um aviso na tela e o botao de enviar/registrar fica desabilitado.</w:t>
+        <w:t>Quem decide: Dono do Negocio, perante a Alta Gestao (registrado institucionalmente; o sistema hoje nao implementa uma trava tecnica separada para este gate especificamente, alem do controle de papeis ja descrito).</w:t>
+      </w:r>
+    </w:p>
+    <w:p>
+      <w:pPr>
+        <w:spacing w:before="120" w:after="200" w:line="260" w:lineRule="auto"/>
+        <w:rPr>
+          <w:color w:val="1A1A1A"/>
+          <w:sz w:val="22"/>
+        </w:rPr>
+      </w:pPr>
+    </w:p>
+    <w:p>
+      <w:pPr>
+        <w:spacing w:before="360" w:line="260" w:lineRule="auto"/>
+        <w:rPr>
+          <w:b/>
+          <w:color w:val="1A1A1A"/>
+          <w:sz w:val="32"/>
+        </w:rPr>
+      </w:pPr>
+      <w:r>
+        <w:rPr>
+          <w:b/>
+          <w:color w:val="1A1A1A"/>
+          <w:sz w:val="32"/>
+        </w:rPr>
+        <w:t>5. Restricao por equipe do projeto</w:t>
+      </w:r>
+    </w:p>
+    <w:p>
+      <w:pPr>
+        <w:spacing w:before="360" w:line="280" w:lineRule="auto"/>
+        <w:rPr>
+          <w:color w:val="1A1A1A"/>
+          <w:sz w:val="22"/>
+        </w:rPr>
+      </w:pPr>
+      <w:r>
+        <w:rPr>
+          <w:color w:val="1A1A1A"/>
+          <w:sz w:val="22"/>
+        </w:rPr>
+        <w:t>Varios formularios exigem vincular o registro a um "Projeto vinculado" (um projeto ja Aprovado no Gate 1). Nesses formularios, apenas quem faz parte da equipe daquele projeto especifico - ou um Admin - pode criar ou editar um registro vinculado a ele.</w:t>
+      </w:r>
+    </w:p>
+    <w:p>
+      <w:pPr>
+        <w:spacing w:before="240" w:after="120" w:line="280" w:lineRule="auto"/>
+        <w:rPr>
+          <w:b/>
+          <w:color w:val="B91D2E"/>
+          <w:sz w:val="26"/>
+        </w:rPr>
+      </w:pPr>
+      <w:r>
+        <w:rPr>
+          <w:b/>
+          <w:color w:val="B91D2E"/>
+          <w:sz w:val="26"/>
+        </w:rPr>
+        <w:t>5.1 Formularios com essa restricao</w:t>
+      </w:r>
+    </w:p>
+    <w:p>
+      <w:pPr>
+        <w:spacing w:before="240" w:line="280" w:lineRule="auto"/>
+        <w:rPr>
+          <w:color w:val="1A1A1A"/>
+          <w:sz w:val="22"/>
+        </w:rPr>
+      </w:pPr>
+      <w:r>
+        <w:rPr>
+          <w:color w:val="1A1A1A"/>
+          <w:sz w:val="22"/>
+        </w:rPr>
+        <w:t>Aplicada nos 7 formularios que usam o conceito de "equipe por projeto":</w:t>
       </w:r>
     </w:p>
     <w:p>
@@ -1346,7 +1228,7 @@
           <w:color w:val="1A1A1A"/>
           <w:sz w:val="22"/>
         </w:rPr>
-        <w:t>Mesmo que o botao seja habilitado por algum outro meio, o envio e bloqueado no momento de salvar, com a mensagem "Voce nao faz parte da equipe deste projeto."</w:t>
+        <w:t>Canvas de Projeto</w:t>
       </w:r>
     </w:p>
     <w:p>
@@ -1368,7 +1250,117 @@
           <w:color w:val="1A1A1A"/>
           <w:sz w:val="22"/>
         </w:rPr>
-        <w:t>A equipe de cada projeto e definida pelo Admin, na pagina de Administracao, aba Equipes.</w:t>
+        <w:t>TAP - Termo de Abertura de Projeto</w:t>
+      </w:r>
+    </w:p>
+    <w:p>
+      <w:pPr>
+        <w:pStyle w:val="PargrafodaLista"/>
+        <w:numPr>
+          <w:ilvl w:val="0"/>
+          <w:numId w:val="8"/>
+        </w:numPr>
+        <w:spacing w:before="240" w:after="80" w:line="260" w:lineRule="auto"/>
+        <w:ind w:left="700"/>
+        <w:rPr>
+          <w:color w:val="1A1A1A"/>
+          <w:sz w:val="22"/>
+        </w:rPr>
+      </w:pPr>
+      <w:r>
+        <w:rPr>
+          <w:color w:val="1A1A1A"/>
+          <w:sz w:val="22"/>
+        </w:rPr>
+        <w:t>Planejamento e Desenvolvimento de Projeto</w:t>
+      </w:r>
+    </w:p>
+    <w:p>
+      <w:pPr>
+        <w:pStyle w:val="PargrafodaLista"/>
+        <w:numPr>
+          <w:ilvl w:val="0"/>
+          <w:numId w:val="8"/>
+        </w:numPr>
+        <w:spacing w:before="240" w:after="80" w:line="260" w:lineRule="auto"/>
+        <w:ind w:left="700"/>
+        <w:rPr>
+          <w:color w:val="1A1A1A"/>
+          <w:sz w:val="22"/>
+        </w:rPr>
+      </w:pPr>
+      <w:r>
+        <w:rPr>
+          <w:color w:val="1A1A1A"/>
+          <w:sz w:val="22"/>
+        </w:rPr>
+        <w:t>EAP - Estrutura Analitica de Projeto</w:t>
+      </w:r>
+    </w:p>
+    <w:p>
+      <w:pPr>
+        <w:pStyle w:val="PargrafodaLista"/>
+        <w:numPr>
+          <w:ilvl w:val="0"/>
+          <w:numId w:val="8"/>
+        </w:numPr>
+        <w:spacing w:before="240" w:after="80" w:line="260" w:lineRule="auto"/>
+        <w:ind w:left="700"/>
+        <w:rPr>
+          <w:color w:val="1A1A1A"/>
+          <w:sz w:val="22"/>
+        </w:rPr>
+      </w:pPr>
+      <w:r>
+        <w:rPr>
+          <w:color w:val="1A1A1A"/>
+          <w:sz w:val="22"/>
+        </w:rPr>
+        <w:t>SMP - Solicitacao de Mudanca de Projeto</w:t>
+      </w:r>
+    </w:p>
+    <w:p>
+      <w:pPr>
+        <w:pStyle w:val="PargrafodaLista"/>
+        <w:numPr>
+          <w:ilvl w:val="0"/>
+          <w:numId w:val="8"/>
+        </w:numPr>
+        <w:spacing w:before="240" w:after="80" w:line="260" w:lineRule="auto"/>
+        <w:ind w:left="700"/>
+        <w:rPr>
+          <w:color w:val="1A1A1A"/>
+          <w:sz w:val="22"/>
+        </w:rPr>
+      </w:pPr>
+      <w:r>
+        <w:rPr>
+          <w:color w:val="1A1A1A"/>
+          <w:sz w:val="22"/>
+        </w:rPr>
+        <w:t>TEP - Termo de Encerramento de Projeto</w:t>
+      </w:r>
+    </w:p>
+    <w:p>
+      <w:pPr>
+        <w:pStyle w:val="PargrafodaLista"/>
+        <w:numPr>
+          <w:ilvl w:val="0"/>
+          <w:numId w:val="8"/>
+        </w:numPr>
+        <w:spacing w:before="240" w:after="80" w:line="260" w:lineRule="auto"/>
+        <w:ind w:left="700"/>
+        <w:rPr>
+          <w:color w:val="1A1A1A"/>
+          <w:sz w:val="22"/>
+        </w:rPr>
+      </w:pPr>
+      <w:r>
+        <w:rPr>
+          <w:color w:val="1A1A1A"/>
+          <w:sz w:val="22"/>
+        </w:rPr>
+        <w:t>RLA - Registro de Licoes Aprendidas</w:t>
       </w:r>
     </w:p>
     <w:p>
@@ -1386,7 +1378,7 @@
           <w:color w:val="B91D2E"/>
           <w:sz w:val="26"/>
         </w:rPr>
-        <w:t>5.3 Formularios sem essa restricao</w:t>
+        <w:t>5.2 Como funciona</w:t>
       </w:r>
     </w:p>
     <w:p>
@@ -1402,7 +1394,7 @@
           <w:color w:val="1A1A1A"/>
           <w:sz w:val="22"/>
         </w:rPr>
-        <w:t>Os demais formularios nao usam o conceito de equipe por projeto - qualquer usuario autenticado pode criar/editar/excluir registros neles, sujeito apenas as regras de papel e (quando aplicavel) as regras especificas ja descritas nas secoes 2 e 4:</w:t>
+        <w:t>Ao selecionar um projeto no campo "Projeto vinculado":</w:t>
       </w:r>
     </w:p>
     <w:p>
@@ -1424,7 +1416,7 @@
           <w:color w:val="1A1A1A"/>
           <w:sz w:val="22"/>
         </w:rPr>
-        <w:t>Solicitacao de Demanda (tem o Gate 1 e a opcao de sem login, descritos acima).</w:t>
+        <w:t>Se a pessoa nao for da equipe daquele projeto (e nao for Admin), aparece um aviso na tela e o botao de enviar/registrar fica desabilitado.</w:t>
       </w:r>
     </w:p>
     <w:p>
@@ -1446,7 +1438,7 @@
           <w:color w:val="1A1A1A"/>
           <w:sz w:val="22"/>
         </w:rPr>
-        <w:t>Ata de Reuniao (tem a opcao de sem login, descrita acima).</w:t>
+        <w:t>Mesmo que o botao seja habilitado por algum outro meio, o envio e bloqueado no momento de salvar, com a mensagem "Voce nao faz parte da equipe deste projeto."</w:t>
       </w:r>
     </w:p>
     <w:p>
@@ -1468,7 +1460,42 @@
           <w:color w:val="1A1A1A"/>
           <w:sz w:val="22"/>
         </w:rPr>
-        <w:t>Plano de Comunicacao de Projeto</w:t>
+        <w:t>A equipe de cada projeto e definida pelo Admin, na pagina de Administracao, aba Equipes.</w:t>
+      </w:r>
+    </w:p>
+    <w:p>
+      <w:pPr>
+        <w:spacing w:before="240" w:after="120" w:line="260" w:lineRule="auto"/>
+        <w:rPr>
+          <w:b/>
+          <w:color w:val="B91D2E"/>
+          <w:sz w:val="26"/>
+        </w:rPr>
+      </w:pPr>
+      <w:r>
+        <w:rPr>
+          <w:b/>
+          <w:color w:val="B91D2E"/>
+          <w:sz w:val="26"/>
+        </w:rPr>
+        <w:t>5.3 Formularios sem essa restricao</w:t>
+      </w:r>
+    </w:p>
+    <w:p>
+      <w:pPr>
+        <w:spacing w:before="240" w:line="280" w:lineRule="auto"/>
+        <w:rPr>
+          <w:color w:val="1A1A1A"/>
+          <w:sz w:val="22"/>
+        </w:rPr>
+      </w:pPr>
+      <w:r>
+        <w:rPr>
+          <w:color w:val="1A1A1A"/>
+          <w:sz w:val="22"/>
+        </w:rPr>
+        <w:lastRenderedPageBreak/>
+        <w:t>Os demais formularios nao usam o conceito de equipe por projeto - qualquer usuario autenticado pode criar/editar/excluir registros neles, sujeito apenas as regras de papel e (quando aplicavel) as regras especificas ja descritas nas secoes 2 e 4:</w:t>
       </w:r>
     </w:p>
     <w:p>
@@ -1476,7 +1503,7 @@
         <w:pStyle w:val="PargrafodaLista"/>
         <w:numPr>
           <w:ilvl w:val="0"/>
-          <w:numId w:val="9"/>
+          <w:numId w:val="10"/>
         </w:numPr>
         <w:spacing w:before="240" w:after="80" w:line="260" w:lineRule="auto"/>
         <w:ind w:left="700"/>
@@ -1490,7 +1517,7 @@
           <w:color w:val="1A1A1A"/>
           <w:sz w:val="22"/>
         </w:rPr>
-        <w:t>Relatorio de Situacao de Projetos</w:t>
+        <w:t>Solicitacao de Demanda (tem o Gate 1 e a opcao de sem login, descritos acima).</w:t>
       </w:r>
     </w:p>
     <w:p>
@@ -1498,7 +1525,73 @@
         <w:pStyle w:val="PargrafodaLista"/>
         <w:numPr>
           <w:ilvl w:val="0"/>
-          <w:numId w:val="9"/>
+          <w:numId w:val="10"/>
+        </w:numPr>
+        <w:spacing w:before="240" w:after="80" w:line="260" w:lineRule="auto"/>
+        <w:ind w:left="700"/>
+        <w:rPr>
+          <w:color w:val="1A1A1A"/>
+          <w:sz w:val="22"/>
+        </w:rPr>
+      </w:pPr>
+      <w:r>
+        <w:rPr>
+          <w:color w:val="1A1A1A"/>
+          <w:sz w:val="22"/>
+        </w:rPr>
+        <w:t>Ata de Reuniao (tem a opcao de sem login, descrita acima).</w:t>
+      </w:r>
+    </w:p>
+    <w:p>
+      <w:pPr>
+        <w:pStyle w:val="PargrafodaLista"/>
+        <w:numPr>
+          <w:ilvl w:val="0"/>
+          <w:numId w:val="10"/>
+        </w:numPr>
+        <w:spacing w:before="240" w:after="80" w:line="260" w:lineRule="auto"/>
+        <w:ind w:left="700"/>
+        <w:rPr>
+          <w:color w:val="1A1A1A"/>
+          <w:sz w:val="22"/>
+        </w:rPr>
+      </w:pPr>
+      <w:r>
+        <w:rPr>
+          <w:color w:val="1A1A1A"/>
+          <w:sz w:val="22"/>
+        </w:rPr>
+        <w:t>Plano de Comunicacao de Projeto</w:t>
+      </w:r>
+    </w:p>
+    <w:p>
+      <w:pPr>
+        <w:pStyle w:val="PargrafodaLista"/>
+        <w:numPr>
+          <w:ilvl w:val="0"/>
+          <w:numId w:val="10"/>
+        </w:numPr>
+        <w:spacing w:before="240" w:after="80" w:line="260" w:lineRule="auto"/>
+        <w:ind w:left="700"/>
+        <w:rPr>
+          <w:color w:val="1A1A1A"/>
+          <w:sz w:val="22"/>
+        </w:rPr>
+      </w:pPr>
+      <w:r>
+        <w:rPr>
+          <w:color w:val="1A1A1A"/>
+          <w:sz w:val="22"/>
+        </w:rPr>
+        <w:t>Relatorio de Situacao de Projetos</w:t>
+      </w:r>
+    </w:p>
+    <w:p>
+      <w:pPr>
+        <w:pStyle w:val="PargrafodaLista"/>
+        <w:numPr>
+          <w:ilvl w:val="0"/>
+          <w:numId w:val="10"/>
         </w:numPr>
         <w:spacing w:before="240" w:after="80" w:line="260" w:lineRule="auto"/>
         <w:ind w:left="700"/>
@@ -1593,7 +1686,6 @@
                 <w:color w:val="FFFFFF"/>
                 <w:sz w:val="19"/>
               </w:rPr>
-              <w:lastRenderedPageBreak/>
               <w:t>Formulario</w:t>
             </w:r>
           </w:p>
@@ -2615,6 +2707,7 @@
                 <w:color w:val="1A1A1A"/>
                 <w:sz w:val="19"/>
               </w:rPr>
+              <w:lastRenderedPageBreak/>
               <w:t>Relatorio de Situacao</w:t>
             </w:r>
           </w:p>
@@ -2912,7 +3005,7 @@
                 <w:color w:val="1A1A1A"/>
                 <w:sz w:val="19"/>
               </w:rPr>
-              <w:t>Sim</w:t>
+              <w:t>Nao (so p/ vincular projeto)</w:t>
             </w:r>
           </w:p>
         </w:tc>
@@ -3009,7 +3102,7 @@
 <file path=word/numbering.xml><?xml version="1.0" encoding="utf-8"?>
 <w:numbering xmlns:wpc="http://schemas.microsoft.com/office/word/2010/wordprocessingCanvas" xmlns:cx="http://schemas.microsoft.com/office/drawing/2014/chartex" xmlns:cx1="http://schemas.microsoft.com/office/drawing/2015/9/8/chartex" xmlns:cx2="http://schemas.microsoft.com/office/drawing/2015/10/21/chartex" xmlns:cx3="http://schemas.microsoft.com/office/drawing/2016/5/9/chartex" xmlns:cx4="http://schemas.microsoft.com/office/drawing/2016/5/10/chartex" xmlns:cx5="http://schemas.microsoft.com/office/drawing/2016/5/11/chartex" xmlns:cx6="http://schemas.microsoft.com/office/drawing/2016/5/12/chartex" xmlns:cx7="http://schemas.microsoft.com/office/drawing/2016/5/13/chartex" xmlns:cx8="http://schemas.microsoft.com/office/drawing/2016/5/14/chartex" xmlns:mc="http://schemas.openxmlformats.org/markup-compatibility/2006" xmlns:aink="http://schemas.microsoft.com/office/drawing/2016/ink" xmlns:am3d="http://schemas.microsoft.com/office/drawing/2017/model3d" xmlns:o="urn:schemas-microsoft-com:office:office" xmlns:oel="http://schemas.microsoft.com/office/2019/extlst" xmlns:r="http://schemas.openxmlformats.org/officeDocument/2006/relationships" xmlns:m="http://schemas.openxmlformats.org/officeDocument/2006/math" xmlns:v="urn:schemas-microsoft-com:vml" xmlns:wp14="http://schemas.microsoft.com/office/word/2010/wordprocessingDrawing" xmlns:wp="http://schemas.openxmlformats.org/drawingml/2006/wordprocessingDrawing" xmlns:w10="urn:schemas-microsoft-com:office:word" xmlns:w="http://schemas.openxmlformats.org/wordprocessingml/2006/main" xmlns:w14="http://schemas.microsoft.com/office/word/2010/wordml" xmlns:w15="http://schemas.microsoft.com/office/word/2012/wordml" xmlns:w16cex="http://schemas.microsoft.com/office/word/2018/wordml/cex" xmlns:w16cid="http://schemas.microsoft.com/office/word/2016/wordml/cid" xmlns:w16="http://schemas.microsoft.com/office/word/2018/wordml" xmlns:w16du="http://schemas.microsoft.com/office/word/2023/wordml/word16du" xmlns:w16sdtdh="http://schemas.microsoft.com/office/word/2020/wordml/sdtdatahash" xmlns:w16sdtfl="http://schemas.microsoft.com/office/word/2024/wordml/sdtformatlock" xmlns:w16se="http://schemas.microsoft.com/office/word/2015/wordml/symex" xmlns:wpg="http://schemas.microsoft.com/office/word/2010/wordprocessingGroup" xmlns:wpi="http://schemas.microsoft.com/office/word/2010/wordprocessingInk" xmlns:wne="http://schemas.microsoft.com/office/word/2006/wordml" xmlns:wps="http://schemas.microsoft.com/office/word/2010/wordprocessingShape" mc:Ignorable="w14 w15 w16se w16cid w16 w16cex w16sdtdh w16sdtfl w16du wp14">
   <w:abstractNum w:abstractNumId="0" w15:restartNumberingAfterBreak="0">
-    <w:nsid w:val="02D005ED"/>
+    <w:nsid w:val="0FFE3F30"/>
     <w:multiLevelType w:val="singleLevel"/>
     <w:tmpl w:val="04160001"/>
     <w:lvl w:ilvl="0">
@@ -3026,7 +3119,7 @@
     </w:lvl>
   </w:abstractNum>
   <w:abstractNum w:abstractNumId="1" w15:restartNumberingAfterBreak="0">
-    <w:nsid w:val="03DB1527"/>
+    <w:nsid w:val="18B34ECB"/>
     <w:multiLevelType w:val="singleLevel"/>
     <w:tmpl w:val="04160001"/>
     <w:lvl w:ilvl="0">
@@ -3043,7 +3136,7 @@
     </w:lvl>
   </w:abstractNum>
   <w:abstractNum w:abstractNumId="2" w15:restartNumberingAfterBreak="0">
-    <w:nsid w:val="052F1595"/>
+    <w:nsid w:val="27CF65FE"/>
     <w:multiLevelType w:val="singleLevel"/>
     <w:tmpl w:val="04160001"/>
     <w:lvl w:ilvl="0">
@@ -3060,7 +3153,7 @@
     </w:lvl>
   </w:abstractNum>
   <w:abstractNum w:abstractNumId="3" w15:restartNumberingAfterBreak="0">
-    <w:nsid w:val="1A526112"/>
+    <w:nsid w:val="37D35A75"/>
     <w:multiLevelType w:val="singleLevel"/>
     <w:tmpl w:val="04160001"/>
     <w:lvl w:ilvl="0">
@@ -3077,7 +3170,7 @@
     </w:lvl>
   </w:abstractNum>
   <w:abstractNum w:abstractNumId="4" w15:restartNumberingAfterBreak="0">
-    <w:nsid w:val="4C6E6071"/>
+    <w:nsid w:val="421F6BFB"/>
     <w:multiLevelType w:val="singleLevel"/>
     <w:tmpl w:val="04160001"/>
     <w:lvl w:ilvl="0">
@@ -3094,7 +3187,7 @@
     </w:lvl>
   </w:abstractNum>
   <w:abstractNum w:abstractNumId="5" w15:restartNumberingAfterBreak="0">
-    <w:nsid w:val="50910551"/>
+    <w:nsid w:val="54D076E0"/>
     <w:multiLevelType w:val="singleLevel"/>
     <w:tmpl w:val="04160001"/>
     <w:lvl w:ilvl="0">
@@ -3111,7 +3204,7 @@
     </w:lvl>
   </w:abstractNum>
   <w:abstractNum w:abstractNumId="6" w15:restartNumberingAfterBreak="0">
-    <w:nsid w:val="5AE011D4"/>
+    <w:nsid w:val="56F07A86"/>
     <w:multiLevelType w:val="singleLevel"/>
     <w:tmpl w:val="04160001"/>
     <w:lvl w:ilvl="0">
@@ -3128,7 +3221,7 @@
     </w:lvl>
   </w:abstractNum>
   <w:abstractNum w:abstractNumId="7" w15:restartNumberingAfterBreak="0">
-    <w:nsid w:val="68612673"/>
+    <w:nsid w:val="67E05C4C"/>
     <w:multiLevelType w:val="singleLevel"/>
     <w:tmpl w:val="04160001"/>
     <w:lvl w:ilvl="0">
@@ -3145,7 +3238,7 @@
     </w:lvl>
   </w:abstractNum>
   <w:abstractNum w:abstractNumId="8" w15:restartNumberingAfterBreak="0">
-    <w:nsid w:val="7D575799"/>
+    <w:nsid w:val="6A756010"/>
     <w:multiLevelType w:val="singleLevel"/>
     <w:tmpl w:val="04160001"/>
     <w:lvl w:ilvl="0">
@@ -3161,32 +3254,52 @@
       </w:rPr>
     </w:lvl>
   </w:abstractNum>
-  <w:num w:numId="1" w16cid:durableId="1750999094">
+  <w:abstractNum w:abstractNumId="9" w15:restartNumberingAfterBreak="0">
+    <w:nsid w:val="7BB65818"/>
+    <w:multiLevelType w:val="singleLevel"/>
+    <w:tmpl w:val="04160001"/>
+    <w:lvl w:ilvl="0">
+      <w:start w:val="1"/>
+      <w:numFmt w:val="bullet"/>
+      <w:lvlText w:val=""/>
+      <w:lvlJc w:val="left"/>
+      <w:pPr>
+        <w:ind w:left="720" w:hanging="360"/>
+      </w:pPr>
+      <w:rPr>
+        <w:rFonts w:ascii="Symbol" w:hAnsi="Symbol" w:hint="default"/>
+      </w:rPr>
+    </w:lvl>
+  </w:abstractNum>
+  <w:num w:numId="1" w16cid:durableId="1254626182">
+    <w:abstractNumId w:val="2"/>
+  </w:num>
+  <w:num w:numId="2" w16cid:durableId="2004040737">
+    <w:abstractNumId w:val="9"/>
+  </w:num>
+  <w:num w:numId="3" w16cid:durableId="1134719499">
     <w:abstractNumId w:val="8"/>
   </w:num>
-  <w:num w:numId="2" w16cid:durableId="1819683831">
+  <w:num w:numId="4" w16cid:durableId="1014308599">
+    <w:abstractNumId w:val="1"/>
+  </w:num>
+  <w:num w:numId="5" w16cid:durableId="1507862582">
     <w:abstractNumId w:val="5"/>
   </w:num>
-  <w:num w:numId="3" w16cid:durableId="1038242324">
-    <w:abstractNumId w:val="1"/>
+  <w:num w:numId="6" w16cid:durableId="1666125588">
+    <w:abstractNumId w:val="3"/>
   </w:num>
-  <w:num w:numId="4" w16cid:durableId="674457742">
+  <w:num w:numId="7" w16cid:durableId="1521239050">
+    <w:abstractNumId w:val="7"/>
+  </w:num>
+  <w:num w:numId="8" w16cid:durableId="138885737">
+    <w:abstractNumId w:val="0"/>
+  </w:num>
+  <w:num w:numId="9" w16cid:durableId="99036545">
     <w:abstractNumId w:val="6"/>
   </w:num>
-  <w:num w:numId="5" w16cid:durableId="87240043">
-    <w:abstractNumId w:val="3"/>
-  </w:num>
-  <w:num w:numId="6" w16cid:durableId="133447066">
-    <w:abstractNumId w:val="2"/>
-  </w:num>
-  <w:num w:numId="7" w16cid:durableId="1740668332">
-    <w:abstractNumId w:val="0"/>
-  </w:num>
-  <w:num w:numId="8" w16cid:durableId="1668171815">
+  <w:num w:numId="10" w16cid:durableId="1205600697">
     <w:abstractNumId w:val="4"/>
-  </w:num>
-  <w:num w:numId="9" w16cid:durableId="1069577426">
-    <w:abstractNumId w:val="7"/>
   </w:num>
 </w:numbering>
 </file>
@@ -3599,7 +3712,7 @@
     <w:link w:val="Ttulo1Char"/>
     <w:uiPriority w:val="9"/>
     <w:qFormat/>
-    <w:rsid w:val="001D37E7"/>
+    <w:rsid w:val="00272849"/>
     <w:pPr>
       <w:keepNext/>
       <w:keepLines/>
@@ -3622,7 +3735,7 @@
     <w:semiHidden/>
     <w:unhideWhenUsed/>
     <w:qFormat/>
-    <w:rsid w:val="001D37E7"/>
+    <w:rsid w:val="00272849"/>
     <w:pPr>
       <w:keepNext/>
       <w:keepLines/>
@@ -3645,7 +3758,7 @@
     <w:semiHidden/>
     <w:unhideWhenUsed/>
     <w:qFormat/>
-    <w:rsid w:val="001D37E7"/>
+    <w:rsid w:val="00272849"/>
     <w:pPr>
       <w:keepNext/>
       <w:keepLines/>
@@ -3668,7 +3781,7 @@
     <w:semiHidden/>
     <w:unhideWhenUsed/>
     <w:qFormat/>
-    <w:rsid w:val="001D37E7"/>
+    <w:rsid w:val="00272849"/>
     <w:pPr>
       <w:keepNext/>
       <w:keepLines/>
@@ -3691,7 +3804,7 @@
     <w:semiHidden/>
     <w:unhideWhenUsed/>
     <w:qFormat/>
-    <w:rsid w:val="001D37E7"/>
+    <w:rsid w:val="00272849"/>
     <w:pPr>
       <w:keepNext/>
       <w:keepLines/>
@@ -3712,7 +3825,7 @@
     <w:semiHidden/>
     <w:unhideWhenUsed/>
     <w:qFormat/>
-    <w:rsid w:val="001D37E7"/>
+    <w:rsid w:val="00272849"/>
     <w:pPr>
       <w:keepNext/>
       <w:keepLines/>
@@ -3735,7 +3848,7 @@
     <w:semiHidden/>
     <w:unhideWhenUsed/>
     <w:qFormat/>
-    <w:rsid w:val="001D37E7"/>
+    <w:rsid w:val="00272849"/>
     <w:pPr>
       <w:keepNext/>
       <w:keepLines/>
@@ -3756,7 +3869,7 @@
     <w:semiHidden/>
     <w:unhideWhenUsed/>
     <w:qFormat/>
-    <w:rsid w:val="001D37E7"/>
+    <w:rsid w:val="00272849"/>
     <w:pPr>
       <w:keepNext/>
       <w:keepLines/>
@@ -3779,7 +3892,7 @@
     <w:semiHidden/>
     <w:unhideWhenUsed/>
     <w:qFormat/>
-    <w:rsid w:val="001D37E7"/>
+    <w:rsid w:val="00272849"/>
     <w:pPr>
       <w:keepNext/>
       <w:keepLines/>
@@ -3823,7 +3936,7 @@
     <w:basedOn w:val="Fontepargpadro"/>
     <w:link w:val="Ttulo1"/>
     <w:uiPriority w:val="9"/>
-    <w:rsid w:val="001D37E7"/>
+    <w:rsid w:val="00272849"/>
     <w:rPr>
       <w:rFonts w:asciiTheme="majorHAnsi" w:eastAsiaTheme="majorEastAsia" w:hAnsiTheme="majorHAnsi" w:cstheme="majorBidi"/>
       <w:color w:val="0F4761" w:themeColor="accent1" w:themeShade="BF"/>
@@ -3837,7 +3950,7 @@
     <w:link w:val="Ttulo2"/>
     <w:uiPriority w:val="9"/>
     <w:semiHidden/>
-    <w:rsid w:val="001D37E7"/>
+    <w:rsid w:val="00272849"/>
     <w:rPr>
       <w:rFonts w:asciiTheme="majorHAnsi" w:eastAsiaTheme="majorEastAsia" w:hAnsiTheme="majorHAnsi" w:cstheme="majorBidi"/>
       <w:color w:val="0F4761" w:themeColor="accent1" w:themeShade="BF"/>
@@ -3851,7 +3964,7 @@
     <w:link w:val="Ttulo3"/>
     <w:uiPriority w:val="9"/>
     <w:semiHidden/>
-    <w:rsid w:val="001D37E7"/>
+    <w:rsid w:val="00272849"/>
     <w:rPr>
       <w:rFonts w:eastAsiaTheme="majorEastAsia" w:cstheme="majorBidi"/>
       <w:color w:val="0F4761" w:themeColor="accent1" w:themeShade="BF"/>
@@ -3865,7 +3978,7 @@
     <w:link w:val="Ttulo4"/>
     <w:uiPriority w:val="9"/>
     <w:semiHidden/>
-    <w:rsid w:val="001D37E7"/>
+    <w:rsid w:val="00272849"/>
     <w:rPr>
       <w:rFonts w:eastAsiaTheme="majorEastAsia" w:cstheme="majorBidi"/>
       <w:i/>
@@ -3879,7 +3992,7 @@
     <w:link w:val="Ttulo5"/>
     <w:uiPriority w:val="9"/>
     <w:semiHidden/>
-    <w:rsid w:val="001D37E7"/>
+    <w:rsid w:val="00272849"/>
     <w:rPr>
       <w:rFonts w:eastAsiaTheme="majorEastAsia" w:cstheme="majorBidi"/>
       <w:color w:val="0F4761" w:themeColor="accent1" w:themeShade="BF"/>
@@ -3891,7 +4004,7 @@
     <w:link w:val="Ttulo6"/>
     <w:uiPriority w:val="9"/>
     <w:semiHidden/>
-    <w:rsid w:val="001D37E7"/>
+    <w:rsid w:val="00272849"/>
     <w:rPr>
       <w:rFonts w:eastAsiaTheme="majorEastAsia" w:cstheme="majorBidi"/>
       <w:i/>
@@ -3905,7 +4018,7 @@
     <w:link w:val="Ttulo7"/>
     <w:uiPriority w:val="9"/>
     <w:semiHidden/>
-    <w:rsid w:val="001D37E7"/>
+    <w:rsid w:val="00272849"/>
     <w:rPr>
       <w:rFonts w:eastAsiaTheme="majorEastAsia" w:cstheme="majorBidi"/>
       <w:color w:val="595959" w:themeColor="text1" w:themeTint="A6"/>
@@ -3917,7 +4030,7 @@
     <w:link w:val="Ttulo8"/>
     <w:uiPriority w:val="9"/>
     <w:semiHidden/>
-    <w:rsid w:val="001D37E7"/>
+    <w:rsid w:val="00272849"/>
     <w:rPr>
       <w:rFonts w:eastAsiaTheme="majorEastAsia" w:cstheme="majorBidi"/>
       <w:i/>
@@ -3931,7 +4044,7 @@
     <w:link w:val="Ttulo9"/>
     <w:uiPriority w:val="9"/>
     <w:semiHidden/>
-    <w:rsid w:val="001D37E7"/>
+    <w:rsid w:val="00272849"/>
     <w:rPr>
       <w:rFonts w:eastAsiaTheme="majorEastAsia" w:cstheme="majorBidi"/>
       <w:color w:val="272727" w:themeColor="text1" w:themeTint="D8"/>
@@ -3944,7 +4057,7 @@
     <w:link w:val="TtuloChar"/>
     <w:uiPriority w:val="10"/>
     <w:qFormat/>
-    <w:rsid w:val="001D37E7"/>
+    <w:rsid w:val="00272849"/>
     <w:pPr>
       <w:spacing w:after="80" w:line="240" w:lineRule="auto"/>
       <w:contextualSpacing/>
@@ -3962,7 +4075,7 @@
     <w:basedOn w:val="Fontepargpadro"/>
     <w:link w:val="Ttulo"/>
     <w:uiPriority w:val="10"/>
-    <w:rsid w:val="001D37E7"/>
+    <w:rsid w:val="00272849"/>
     <w:rPr>
       <w:rFonts w:asciiTheme="majorHAnsi" w:eastAsiaTheme="majorEastAsia" w:hAnsiTheme="majorHAnsi" w:cstheme="majorBidi"/>
       <w:spacing w:val="-10"/>
@@ -3978,7 +4091,7 @@
     <w:link w:val="SubttuloChar"/>
     <w:uiPriority w:val="11"/>
     <w:qFormat/>
-    <w:rsid w:val="001D37E7"/>
+    <w:rsid w:val="00272849"/>
     <w:pPr>
       <w:numPr>
         <w:ilvl w:val="1"/>
@@ -3997,7 +4110,7 @@
     <w:basedOn w:val="Fontepargpadro"/>
     <w:link w:val="Subttulo"/>
     <w:uiPriority w:val="11"/>
-    <w:rsid w:val="001D37E7"/>
+    <w:rsid w:val="00272849"/>
     <w:rPr>
       <w:rFonts w:eastAsiaTheme="majorEastAsia" w:cstheme="majorBidi"/>
       <w:color w:val="595959" w:themeColor="text1" w:themeTint="A6"/>
@@ -4013,7 +4126,7 @@
     <w:link w:val="CitaoChar"/>
     <w:uiPriority w:val="29"/>
     <w:qFormat/>
-    <w:rsid w:val="001D37E7"/>
+    <w:rsid w:val="00272849"/>
     <w:pPr>
       <w:spacing w:before="160"/>
       <w:jc w:val="center"/>
@@ -4029,7 +4142,7 @@
     <w:basedOn w:val="Fontepargpadro"/>
     <w:link w:val="Citao"/>
     <w:uiPriority w:val="29"/>
-    <w:rsid w:val="001D37E7"/>
+    <w:rsid w:val="00272849"/>
     <w:rPr>
       <w:i/>
       <w:iCs/>
@@ -4041,7 +4154,7 @@
     <w:basedOn w:val="Normal"/>
     <w:uiPriority w:val="34"/>
     <w:qFormat/>
-    <w:rsid w:val="001D37E7"/>
+    <w:rsid w:val="00272849"/>
     <w:pPr>
       <w:ind w:left="720"/>
       <w:contextualSpacing/>
@@ -4052,7 +4165,7 @@
     <w:basedOn w:val="Fontepargpadro"/>
     <w:uiPriority w:val="21"/>
     <w:qFormat/>
-    <w:rsid w:val="001D37E7"/>
+    <w:rsid w:val="00272849"/>
     <w:rPr>
       <w:i/>
       <w:iCs/>
@@ -4066,7 +4179,7 @@
     <w:link w:val="CitaoIntensaChar"/>
     <w:uiPriority w:val="30"/>
     <w:qFormat/>
-    <w:rsid w:val="001D37E7"/>
+    <w:rsid w:val="00272849"/>
     <w:pPr>
       <w:pBdr>
         <w:top w:val="single" w:sz="4" w:space="10" w:color="0F4761" w:themeColor="accent1" w:themeShade="BF"/>
@@ -4087,7 +4200,7 @@
     <w:basedOn w:val="Fontepargpadro"/>
     <w:link w:val="CitaoIntensa"/>
     <w:uiPriority w:val="30"/>
-    <w:rsid w:val="001D37E7"/>
+    <w:rsid w:val="00272849"/>
     <w:rPr>
       <w:i/>
       <w:iCs/>
@@ -4099,7 +4212,7 @@
     <w:basedOn w:val="Fontepargpadro"/>
     <w:uiPriority w:val="32"/>
     <w:qFormat/>
-    <w:rsid w:val="001D37E7"/>
+    <w:rsid w:val="00272849"/>
     <w:rPr>
       <w:b/>
       <w:bCs/>

</xml_diff>